<commit_message>
perbaikan controller beserta detail pada tambahahn colom untuk ttl dan usia beserta perbaikan faq dan perbaikan export pada sisi admin [DONE] Note 3 colom update kedepan tidak perlu  nullable
</commit_message>
<xml_diff>
--- a/public/file_template/10. FAQ REKRUTMEN PEGAWAI BLUD.docx
+++ b/public/file_template/10. FAQ REKRUTMEN PEGAWAI BLUD.docx
@@ -33,31 +33,31 @@
           <w:bCs/>
           <w:lang w:val="en-ID"/>
         </w:rPr>
-        <w:t>RUMAH SAKIT DAERAH KALISAT TAHUN 2026</w:t>
-      </w:r>
-    </w:p>
-    <w:p>
-      <w:pPr>
-        <w:rPr>
-          <w:lang w:val="en-ID"/>
-        </w:rPr>
-      </w:pPr>
-    </w:p>
-    <w:p>
-      <w:pPr>
-        <w:rPr>
-          <w:b/>
-          <w:bCs/>
-          <w:lang w:val="en-ID"/>
-        </w:rPr>
-      </w:pPr>
-      <w:r>
-        <w:rPr>
-          <w:b/>
-          <w:bCs/>
-          <w:lang w:val="en-ID"/>
-        </w:rPr>
-        <w:t>1. Apa saja formasi yang dibuka pada rekrutmen BLUD RSD Kalisat Tahun 2026?</w:t>
+        <w:t>RUMAH SAKIT DAERAH TAHUN 2026</w:t>
+      </w:r>
+    </w:p>
+    <w:p>
+      <w:pPr>
+        <w:rPr>
+          <w:lang w:val="en-ID"/>
+        </w:rPr>
+      </w:pPr>
+    </w:p>
+    <w:p>
+      <w:pPr>
+        <w:rPr>
+          <w:b/>
+          <w:bCs/>
+          <w:lang w:val="en-ID"/>
+        </w:rPr>
+      </w:pPr>
+      <w:r>
+        <w:rPr>
+          <w:b/>
+          <w:bCs/>
+          <w:lang w:val="en-ID"/>
+        </w:rPr>
+        <w:t>1. Apa saja formasi yang dibuka pada rekrutmen BLUD RSD  Tahun 2026?</w:t>
       </w:r>
     </w:p>
     <w:p>
@@ -420,7 +420,7 @@
         <w:rPr>
           <w:lang w:val="en-ID"/>
         </w:rPr>
-        <w:t xml:space="preserve">Tidak. Seluruh proses pendaftaran dilakukan secara online melalui website resmi RSD Kalisat, termasuk pengisian data dan unggah dokumen persyaratan. </w:t>
+        <w:t xml:space="preserve">Tidak. Seluruh proses pendaftaran dilakukan secara online melalui website resmi RSD , termasuk pengisian data dan unggah dokumen persyaratan. </w:t>
       </w:r>
     </w:p>
     <w:p>
@@ -598,7 +598,7 @@
         <w:rPr>
           <w:lang w:val="en-ID"/>
         </w:rPr>
-        <w:t xml:space="preserve">Khusus pelamar yang telah mengabdi di RSD Kalisat, usia maksimal adalah </w:t>
+        <w:t xml:space="preserve">Khusus pelamar yang telah mengabdi di RSD , usia maksimal adalah </w:t>
       </w:r>
       <w:r>
         <w:rPr>
@@ -1257,7 +1257,7 @@
         <w:rPr>
           <w:lang w:val="en-ID"/>
         </w:rPr>
-        <w:t xml:space="preserve">melalui website resmi RSD Kalisat. </w:t>
+        <w:t xml:space="preserve">melalui website resmi RSD . </w:t>
       </w:r>
     </w:p>
     <w:p>
@@ -1424,7 +1424,7 @@
         <w:rPr>
           <w:lang w:val="en-ID"/>
         </w:rPr>
-        <w:t xml:space="preserve">Ya. Peserta yang lolos seleksi kompetensi akan mengikuti tahapan wawancara kompetensi di Rumah Sakit Daerah Kalisat. </w:t>
+        <w:t xml:space="preserve">Ya. Peserta yang lolos seleksi kompetensi akan mengikuti tahapan wawancara kompetensi di Rumah Sakit Daerah . </w:t>
       </w:r>
     </w:p>
     <w:p>
@@ -1519,7 +1519,7 @@
         <w:rPr>
           <w:lang w:val="en-ID"/>
         </w:rPr>
-        <w:t xml:space="preserve">Ya. Peserta yang lolos tahapan wawancara akan mengikuti psikotes/MMPI di RSD dr. Soebandi. Biaya psikotes ditanggung oleh Rumah Sakit Daerah Kalisat. </w:t>
+        <w:t xml:space="preserve">Ya. Peserta yang lolos tahapan wawancara akan mengikuti psikotes/MMPI di RSD dr. Soebandi. Biaya psikotes ditanggung oleh Rumah Sakit Daerah . </w:t>
       </w:r>
     </w:p>
     <w:p>
@@ -1614,7 +1614,7 @@
         <w:rPr>
           <w:lang w:val="en-ID"/>
         </w:rPr>
-        <w:t xml:space="preserve"> melalui website resmi Rumah Sakit Daerah Kalisat. </w:t>
+        <w:t xml:space="preserve"> melalui website resmi Rumah Sakit Daerah . </w:t>
       </w:r>
     </w:p>
     <w:p>
@@ -1799,7 +1799,7 @@
           <w:lang w:val="en-ID"/>
         </w:rPr>
         <w:lastRenderedPageBreak/>
-        <w:t>Ya. Informasi resmi dan bantuan terkait proses rekrutmen hanya disampaikan melalui media resmi Rumah Sakit Daerah Kalisat. Pelamar diimbau berhati-hati terhadap penipuan yang mengatasnamakan panitia rekrutmen.</w:t>
+        <w:t>Ya. Informasi resmi dan bantuan terkait proses rekrutmen hanya disampaikan melalui media resmi Rumah Sakit Daerah . Pelamar diimbau berhati-hati terhadap penipuan yang mengatasnamakan panitia rekrutmen.</w:t>
       </w:r>
     </w:p>
     <w:p>
@@ -1827,7 +1827,7 @@
             <w:rStyle w:val="Hyperlink"/>
             <w:lang w:val="en-ID"/>
           </w:rPr>
-          <w:t>Website Resmi RSD Kalisat</w:t>
+          <w:t xml:space="preserve">Website Resmi RSD </w:t>
         </w:r>
       </w:hyperlink>
     </w:p>
@@ -1865,7 +1865,7 @@
         <w:rPr>
           <w:lang w:val="en-ID"/>
         </w:rPr>
-        <w:t>Tidak. Proses rekrutmen Pegawai BLUD RSD Kalisat tidak dipungut biaya dalam bentuk apapun, kecuali biaya medical check-up yang menjadi tanggungan peserta sesuai ketentuan.</w:t>
+        <w:t>Tidak. Proses rekrutmen Pegawai BLUD RSD  tidak dipungut biaya dalam bentuk apapun, kecuali biaya medical check-up yang menjadi tanggungan peserta sesuai ketentuan.</w:t>
       </w:r>
     </w:p>
     <w:p>
@@ -1996,7 +1996,7 @@
         <w:rPr>
           <w:lang w:val="en-ID"/>
         </w:rPr>
-        <w:t>Jika kendala masih terjadi, pelamar dapat menghubungi helpdesk resmi yang diumumkan melalui website RSD Kalisat.</w:t>
+        <w:t>Jika kendala masih terjadi, pelamar dapat menghubungi helpdesk resmi yang diumumkan melalui website RSD .</w:t>
       </w:r>
     </w:p>
     <w:p/>

</xml_diff>